<commit_message>
Add light theme + embed fonts; theme-aware CLI and verifier
</commit_message>
<xml_diff>
--- a/Romance_Night_60_Cards.docx
+++ b/Romance_Night_60_Cards.docx
@@ -212,7 +212,7 @@
                 <w:rFonts w:ascii="EB Garamond" w:hAnsi="EB Garamond"/>
                 <w:b w:val="0"/>
                 <w:i/>
-                <w:color w:val="8A6F32"/>
+                <w:color w:val="A98A44"/>
                 <w:sz w:val="20"/>
                 <w:spacing w:val="20"/>
               </w:rPr>
@@ -385,7 +385,7 @@
                 <w:rFonts w:ascii="EB Garamond" w:hAnsi="EB Garamond"/>
                 <w:b w:val="0"/>
                 <w:i/>
-                <w:color w:val="8A6F32"/>
+                <w:color w:val="A98A44"/>
                 <w:sz w:val="15"/>
                 <w:spacing w:val="15"/>
               </w:rPr>
@@ -512,7 +512,7 @@
                 <w:rFonts w:ascii="EB Garamond" w:hAnsi="EB Garamond"/>
                 <w:b w:val="0"/>
                 <w:i/>
-                <w:color w:val="8A6F32"/>
+                <w:color w:val="A98A44"/>
                 <w:sz w:val="15"/>
                 <w:spacing w:val="15"/>
               </w:rPr>
@@ -645,7 +645,7 @@
                 <w:rFonts w:ascii="EB Garamond" w:hAnsi="EB Garamond"/>
                 <w:b w:val="0"/>
                 <w:i/>
-                <w:color w:val="8A6F32"/>
+                <w:color w:val="A98A44"/>
                 <w:sz w:val="15"/>
                 <w:spacing w:val="15"/>
               </w:rPr>
@@ -772,7 +772,7 @@
                 <w:rFonts w:ascii="EB Garamond" w:hAnsi="EB Garamond"/>
                 <w:b w:val="0"/>
                 <w:i/>
-                <w:color w:val="8A6F32"/>
+                <w:color w:val="A98A44"/>
                 <w:sz w:val="15"/>
                 <w:spacing w:val="15"/>
               </w:rPr>
@@ -905,7 +905,7 @@
                 <w:rFonts w:ascii="EB Garamond" w:hAnsi="EB Garamond"/>
                 <w:b w:val="0"/>
                 <w:i/>
-                <w:color w:val="8A6F32"/>
+                <w:color w:val="A98A44"/>
                 <w:sz w:val="15"/>
                 <w:spacing w:val="15"/>
               </w:rPr>
@@ -1032,7 +1032,7 @@
                 <w:rFonts w:ascii="EB Garamond" w:hAnsi="EB Garamond"/>
                 <w:b w:val="0"/>
                 <w:i/>
-                <w:color w:val="8A6F32"/>
+                <w:color w:val="A98A44"/>
                 <w:sz w:val="15"/>
                 <w:spacing w:val="15"/>
               </w:rPr>
@@ -1673,7 +1673,7 @@
                 <w:rFonts w:ascii="EB Garamond" w:hAnsi="EB Garamond"/>
                 <w:b w:val="0"/>
                 <w:i/>
-                <w:color w:val="8A6F32"/>
+                <w:color w:val="A98A44"/>
                 <w:sz w:val="15"/>
                 <w:spacing w:val="15"/>
               </w:rPr>
@@ -1800,7 +1800,7 @@
                 <w:rFonts w:ascii="EB Garamond" w:hAnsi="EB Garamond"/>
                 <w:b w:val="0"/>
                 <w:i/>
-                <w:color w:val="8A6F32"/>
+                <w:color w:val="A98A44"/>
                 <w:sz w:val="15"/>
                 <w:spacing w:val="15"/>
               </w:rPr>
@@ -1933,7 +1933,7 @@
                 <w:rFonts w:ascii="EB Garamond" w:hAnsi="EB Garamond"/>
                 <w:b w:val="0"/>
                 <w:i/>
-                <w:color w:val="8A6F32"/>
+                <w:color w:val="A98A44"/>
                 <w:sz w:val="15"/>
                 <w:spacing w:val="15"/>
               </w:rPr>
@@ -2060,7 +2060,7 @@
                 <w:rFonts w:ascii="EB Garamond" w:hAnsi="EB Garamond"/>
                 <w:b w:val="0"/>
                 <w:i/>
-                <w:color w:val="8A6F32"/>
+                <w:color w:val="A98A44"/>
                 <w:sz w:val="15"/>
                 <w:spacing w:val="15"/>
               </w:rPr>
@@ -2193,7 +2193,7 @@
                 <w:rFonts w:ascii="EB Garamond" w:hAnsi="EB Garamond"/>
                 <w:b w:val="0"/>
                 <w:i/>
-                <w:color w:val="8A6F32"/>
+                <w:color w:val="A98A44"/>
                 <w:sz w:val="15"/>
                 <w:spacing w:val="15"/>
               </w:rPr>
@@ -2320,7 +2320,7 @@
                 <w:rFonts w:ascii="EB Garamond" w:hAnsi="EB Garamond"/>
                 <w:b w:val="0"/>
                 <w:i/>
-                <w:color w:val="8A6F32"/>
+                <w:color w:val="A98A44"/>
                 <w:sz w:val="15"/>
                 <w:spacing w:val="15"/>
               </w:rPr>
@@ -2961,7 +2961,7 @@
                 <w:rFonts w:ascii="EB Garamond" w:hAnsi="EB Garamond"/>
                 <w:b w:val="0"/>
                 <w:i/>
-                <w:color w:val="8A6F32"/>
+                <w:color w:val="A98A44"/>
                 <w:sz w:val="15"/>
                 <w:spacing w:val="15"/>
               </w:rPr>
@@ -3088,7 +3088,7 @@
                 <w:rFonts w:ascii="EB Garamond" w:hAnsi="EB Garamond"/>
                 <w:b w:val="0"/>
                 <w:i/>
-                <w:color w:val="8A6F32"/>
+                <w:color w:val="A98A44"/>
                 <w:sz w:val="15"/>
                 <w:spacing w:val="15"/>
               </w:rPr>
@@ -3221,7 +3221,7 @@
                 <w:rFonts w:ascii="EB Garamond" w:hAnsi="EB Garamond"/>
                 <w:b w:val="0"/>
                 <w:i/>
-                <w:color w:val="8A6F32"/>
+                <w:color w:val="A98A44"/>
                 <w:sz w:val="15"/>
                 <w:spacing w:val="15"/>
               </w:rPr>
@@ -3348,7 +3348,7 @@
                 <w:rFonts w:ascii="EB Garamond" w:hAnsi="EB Garamond"/>
                 <w:b w:val="0"/>
                 <w:i/>
-                <w:color w:val="8A6F32"/>
+                <w:color w:val="A98A44"/>
                 <w:sz w:val="15"/>
                 <w:spacing w:val="15"/>
               </w:rPr>
@@ -3481,7 +3481,7 @@
                 <w:rFonts w:ascii="EB Garamond" w:hAnsi="EB Garamond"/>
                 <w:b w:val="0"/>
                 <w:i/>
-                <w:color w:val="8A6F32"/>
+                <w:color w:val="A98A44"/>
                 <w:sz w:val="15"/>
                 <w:spacing w:val="15"/>
               </w:rPr>
@@ -3608,7 +3608,7 @@
                 <w:rFonts w:ascii="EB Garamond" w:hAnsi="EB Garamond"/>
                 <w:b w:val="0"/>
                 <w:i/>
-                <w:color w:val="8A6F32"/>
+                <w:color w:val="A98A44"/>
                 <w:sz w:val="15"/>
                 <w:spacing w:val="15"/>
               </w:rPr>
@@ -4249,7 +4249,7 @@
                 <w:rFonts w:ascii="EB Garamond" w:hAnsi="EB Garamond"/>
                 <w:b w:val="0"/>
                 <w:i/>
-                <w:color w:val="8A6F32"/>
+                <w:color w:val="A98A44"/>
                 <w:sz w:val="15"/>
                 <w:spacing w:val="15"/>
               </w:rPr>
@@ -4376,7 +4376,7 @@
                 <w:rFonts w:ascii="EB Garamond" w:hAnsi="EB Garamond"/>
                 <w:b w:val="0"/>
                 <w:i/>
-                <w:color w:val="8A6F32"/>
+                <w:color w:val="A98A44"/>
                 <w:sz w:val="15"/>
                 <w:spacing w:val="15"/>
               </w:rPr>
@@ -4509,7 +4509,7 @@
                 <w:rFonts w:ascii="EB Garamond" w:hAnsi="EB Garamond"/>
                 <w:b w:val="0"/>
                 <w:i/>
-                <w:color w:val="8A6F32"/>
+                <w:color w:val="A98A44"/>
                 <w:sz w:val="15"/>
                 <w:spacing w:val="15"/>
               </w:rPr>
@@ -4636,7 +4636,7 @@
                 <w:rFonts w:ascii="EB Garamond" w:hAnsi="EB Garamond"/>
                 <w:b w:val="0"/>
                 <w:i/>
-                <w:color w:val="8A6F32"/>
+                <w:color w:val="A98A44"/>
                 <w:sz w:val="15"/>
                 <w:spacing w:val="15"/>
               </w:rPr>
@@ -4769,7 +4769,7 @@
                 <w:rFonts w:ascii="EB Garamond" w:hAnsi="EB Garamond"/>
                 <w:b w:val="0"/>
                 <w:i/>
-                <w:color w:val="8A6F32"/>
+                <w:color w:val="A98A44"/>
                 <w:sz w:val="15"/>
                 <w:spacing w:val="15"/>
               </w:rPr>
@@ -4896,7 +4896,7 @@
                 <w:rFonts w:ascii="EB Garamond" w:hAnsi="EB Garamond"/>
                 <w:b w:val="0"/>
                 <w:i/>
-                <w:color w:val="8A6F32"/>
+                <w:color w:val="A98A44"/>
                 <w:sz w:val="15"/>
                 <w:spacing w:val="15"/>
               </w:rPr>
@@ -5537,7 +5537,7 @@
                 <w:rFonts w:ascii="EB Garamond" w:hAnsi="EB Garamond"/>
                 <w:b w:val="0"/>
                 <w:i/>
-                <w:color w:val="8A6F32"/>
+                <w:color w:val="A98A44"/>
                 <w:sz w:val="15"/>
                 <w:spacing w:val="15"/>
               </w:rPr>
@@ -5664,7 +5664,7 @@
                 <w:rFonts w:ascii="EB Garamond" w:hAnsi="EB Garamond"/>
                 <w:b w:val="0"/>
                 <w:i/>
-                <w:color w:val="8A6F32"/>
+                <w:color w:val="A98A44"/>
                 <w:sz w:val="15"/>
                 <w:spacing w:val="15"/>
               </w:rPr>
@@ -5797,7 +5797,7 @@
                 <w:rFonts w:ascii="EB Garamond" w:hAnsi="EB Garamond"/>
                 <w:b w:val="0"/>
                 <w:i/>
-                <w:color w:val="8A6F32"/>
+                <w:color w:val="A98A44"/>
                 <w:sz w:val="15"/>
                 <w:spacing w:val="15"/>
               </w:rPr>
@@ -5924,7 +5924,7 @@
                 <w:rFonts w:ascii="EB Garamond" w:hAnsi="EB Garamond"/>
                 <w:b w:val="0"/>
                 <w:i/>
-                <w:color w:val="8A6F32"/>
+                <w:color w:val="A98A44"/>
                 <w:sz w:val="15"/>
                 <w:spacing w:val="15"/>
               </w:rPr>
@@ -6057,7 +6057,7 @@
                 <w:rFonts w:ascii="EB Garamond" w:hAnsi="EB Garamond"/>
                 <w:b w:val="0"/>
                 <w:i/>
-                <w:color w:val="8A6F32"/>
+                <w:color w:val="A98A44"/>
                 <w:sz w:val="15"/>
                 <w:spacing w:val="15"/>
               </w:rPr>
@@ -6184,7 +6184,7 @@
                 <w:rFonts w:ascii="EB Garamond" w:hAnsi="EB Garamond"/>
                 <w:b w:val="0"/>
                 <w:i/>
-                <w:color w:val="8A6F32"/>
+                <w:color w:val="A98A44"/>
                 <w:sz w:val="15"/>
                 <w:spacing w:val="15"/>
               </w:rPr>
@@ -6825,7 +6825,7 @@
                 <w:rFonts w:ascii="EB Garamond" w:hAnsi="EB Garamond"/>
                 <w:b w:val="0"/>
                 <w:i/>
-                <w:color w:val="8A6F32"/>
+                <w:color w:val="A98A44"/>
                 <w:sz w:val="15"/>
                 <w:spacing w:val="15"/>
               </w:rPr>
@@ -6952,7 +6952,7 @@
                 <w:rFonts w:ascii="EB Garamond" w:hAnsi="EB Garamond"/>
                 <w:b w:val="0"/>
                 <w:i/>
-                <w:color w:val="8A6F32"/>
+                <w:color w:val="A98A44"/>
                 <w:sz w:val="15"/>
                 <w:spacing w:val="15"/>
               </w:rPr>
@@ -7085,7 +7085,7 @@
                 <w:rFonts w:ascii="EB Garamond" w:hAnsi="EB Garamond"/>
                 <w:b w:val="0"/>
                 <w:i/>
-                <w:color w:val="8A6F32"/>
+                <w:color w:val="A98A44"/>
                 <w:sz w:val="15"/>
                 <w:spacing w:val="15"/>
               </w:rPr>
@@ -7212,7 +7212,7 @@
                 <w:rFonts w:ascii="EB Garamond" w:hAnsi="EB Garamond"/>
                 <w:b w:val="0"/>
                 <w:i/>
-                <w:color w:val="8A6F32"/>
+                <w:color w:val="A98A44"/>
                 <w:sz w:val="15"/>
                 <w:spacing w:val="15"/>
               </w:rPr>
@@ -7345,7 +7345,7 @@
                 <w:rFonts w:ascii="EB Garamond" w:hAnsi="EB Garamond"/>
                 <w:b w:val="0"/>
                 <w:i/>
-                <w:color w:val="8A6F32"/>
+                <w:color w:val="A98A44"/>
                 <w:sz w:val="15"/>
                 <w:spacing w:val="15"/>
               </w:rPr>
@@ -7472,7 +7472,7 @@
                 <w:rFonts w:ascii="EB Garamond" w:hAnsi="EB Garamond"/>
                 <w:b w:val="0"/>
                 <w:i/>
-                <w:color w:val="8A6F32"/>
+                <w:color w:val="A98A44"/>
                 <w:sz w:val="15"/>
                 <w:spacing w:val="15"/>
               </w:rPr>
@@ -8113,7 +8113,7 @@
                 <w:rFonts w:ascii="EB Garamond" w:hAnsi="EB Garamond"/>
                 <w:b w:val="0"/>
                 <w:i/>
-                <w:color w:val="8A6F32"/>
+                <w:color w:val="A98A44"/>
                 <w:sz w:val="15"/>
                 <w:spacing w:val="15"/>
               </w:rPr>
@@ -8240,7 +8240,7 @@
                 <w:rFonts w:ascii="EB Garamond" w:hAnsi="EB Garamond"/>
                 <w:b w:val="0"/>
                 <w:i/>
-                <w:color w:val="8A6F32"/>
+                <w:color w:val="A98A44"/>
                 <w:sz w:val="15"/>
                 <w:spacing w:val="15"/>
               </w:rPr>
@@ -8373,7 +8373,7 @@
                 <w:rFonts w:ascii="EB Garamond" w:hAnsi="EB Garamond"/>
                 <w:b w:val="0"/>
                 <w:i/>
-                <w:color w:val="8A6F32"/>
+                <w:color w:val="A98A44"/>
                 <w:sz w:val="15"/>
                 <w:spacing w:val="15"/>
               </w:rPr>
@@ -8500,7 +8500,7 @@
                 <w:rFonts w:ascii="EB Garamond" w:hAnsi="EB Garamond"/>
                 <w:b w:val="0"/>
                 <w:i/>
-                <w:color w:val="8A6F32"/>
+                <w:color w:val="A98A44"/>
                 <w:sz w:val="15"/>
                 <w:spacing w:val="15"/>
               </w:rPr>
@@ -8633,7 +8633,7 @@
                 <w:rFonts w:ascii="EB Garamond" w:hAnsi="EB Garamond"/>
                 <w:b w:val="0"/>
                 <w:i/>
-                <w:color w:val="8A6F32"/>
+                <w:color w:val="A98A44"/>
                 <w:sz w:val="15"/>
                 <w:spacing w:val="15"/>
               </w:rPr>
@@ -8760,7 +8760,7 @@
                 <w:rFonts w:ascii="EB Garamond" w:hAnsi="EB Garamond"/>
                 <w:b w:val="0"/>
                 <w:i/>
-                <w:color w:val="8A6F32"/>
+                <w:color w:val="A98A44"/>
                 <w:sz w:val="15"/>
                 <w:spacing w:val="15"/>
               </w:rPr>
@@ -9401,7 +9401,7 @@
                 <w:rFonts w:ascii="EB Garamond" w:hAnsi="EB Garamond"/>
                 <w:b w:val="0"/>
                 <w:i/>
-                <w:color w:val="8A6F32"/>
+                <w:color w:val="A98A44"/>
                 <w:sz w:val="15"/>
                 <w:spacing w:val="15"/>
               </w:rPr>
@@ -9528,7 +9528,7 @@
                 <w:rFonts w:ascii="EB Garamond" w:hAnsi="EB Garamond"/>
                 <w:b w:val="0"/>
                 <w:i/>
-                <w:color w:val="8A6F32"/>
+                <w:color w:val="A98A44"/>
                 <w:sz w:val="15"/>
                 <w:spacing w:val="15"/>
               </w:rPr>
@@ -9661,7 +9661,7 @@
                 <w:rFonts w:ascii="EB Garamond" w:hAnsi="EB Garamond"/>
                 <w:b w:val="0"/>
                 <w:i/>
-                <w:color w:val="8A6F32"/>
+                <w:color w:val="A98A44"/>
                 <w:sz w:val="15"/>
                 <w:spacing w:val="15"/>
               </w:rPr>
@@ -9788,7 +9788,7 @@
                 <w:rFonts w:ascii="EB Garamond" w:hAnsi="EB Garamond"/>
                 <w:b w:val="0"/>
                 <w:i/>
-                <w:color w:val="8A6F32"/>
+                <w:color w:val="A98A44"/>
                 <w:sz w:val="15"/>
                 <w:spacing w:val="15"/>
               </w:rPr>
@@ -9921,7 +9921,7 @@
                 <w:rFonts w:ascii="EB Garamond" w:hAnsi="EB Garamond"/>
                 <w:b w:val="0"/>
                 <w:i/>
-                <w:color w:val="8A6F32"/>
+                <w:color w:val="A98A44"/>
                 <w:sz w:val="15"/>
                 <w:spacing w:val="15"/>
               </w:rPr>
@@ -10048,7 +10048,7 @@
                 <w:rFonts w:ascii="EB Garamond" w:hAnsi="EB Garamond"/>
                 <w:b w:val="0"/>
                 <w:i/>
-                <w:color w:val="8A6F32"/>
+                <w:color w:val="A98A44"/>
                 <w:sz w:val="15"/>
                 <w:spacing w:val="15"/>
               </w:rPr>
@@ -10689,7 +10689,7 @@
                 <w:rFonts w:ascii="EB Garamond" w:hAnsi="EB Garamond"/>
                 <w:b w:val="0"/>
                 <w:i/>
-                <w:color w:val="8A6F32"/>
+                <w:color w:val="A98A44"/>
                 <w:sz w:val="15"/>
                 <w:spacing w:val="15"/>
               </w:rPr>
@@ -10816,7 +10816,7 @@
                 <w:rFonts w:ascii="EB Garamond" w:hAnsi="EB Garamond"/>
                 <w:b w:val="0"/>
                 <w:i/>
-                <w:color w:val="8A6F32"/>
+                <w:color w:val="A98A44"/>
                 <w:sz w:val="15"/>
                 <w:spacing w:val="15"/>
               </w:rPr>
@@ -10949,7 +10949,7 @@
                 <w:rFonts w:ascii="EB Garamond" w:hAnsi="EB Garamond"/>
                 <w:b w:val="0"/>
                 <w:i/>
-                <w:color w:val="8A6F32"/>
+                <w:color w:val="A98A44"/>
                 <w:sz w:val="15"/>
                 <w:spacing w:val="15"/>
               </w:rPr>
@@ -11076,7 +11076,7 @@
                 <w:rFonts w:ascii="EB Garamond" w:hAnsi="EB Garamond"/>
                 <w:b w:val="0"/>
                 <w:i/>
-                <w:color w:val="8A6F32"/>
+                <w:color w:val="A98A44"/>
                 <w:sz w:val="15"/>
                 <w:spacing w:val="15"/>
               </w:rPr>
@@ -11209,7 +11209,7 @@
                 <w:rFonts w:ascii="EB Garamond" w:hAnsi="EB Garamond"/>
                 <w:b w:val="0"/>
                 <w:i/>
-                <w:color w:val="8A6F32"/>
+                <w:color w:val="A98A44"/>
                 <w:sz w:val="15"/>
                 <w:spacing w:val="15"/>
               </w:rPr>
@@ -11336,7 +11336,7 @@
                 <w:rFonts w:ascii="EB Garamond" w:hAnsi="EB Garamond"/>
                 <w:b w:val="0"/>
                 <w:i/>
-                <w:color w:val="8A6F32"/>
+                <w:color w:val="A98A44"/>
                 <w:sz w:val="15"/>
                 <w:spacing w:val="15"/>
               </w:rPr>
@@ -11977,7 +11977,7 @@
                 <w:rFonts w:ascii="EB Garamond" w:hAnsi="EB Garamond"/>
                 <w:b w:val="0"/>
                 <w:i/>
-                <w:color w:val="8A6F32"/>
+                <w:color w:val="A98A44"/>
                 <w:sz w:val="15"/>
                 <w:spacing w:val="15"/>
               </w:rPr>
@@ -12104,7 +12104,7 @@
                 <w:rFonts w:ascii="EB Garamond" w:hAnsi="EB Garamond"/>
                 <w:b w:val="0"/>
                 <w:i/>
-                <w:color w:val="8A6F32"/>
+                <w:color w:val="A98A44"/>
                 <w:sz w:val="15"/>
                 <w:spacing w:val="15"/>
               </w:rPr>
@@ -12237,7 +12237,7 @@
                 <w:rFonts w:ascii="EB Garamond" w:hAnsi="EB Garamond"/>
                 <w:b w:val="0"/>
                 <w:i/>
-                <w:color w:val="8A6F32"/>
+                <w:color w:val="A98A44"/>
                 <w:sz w:val="15"/>
                 <w:spacing w:val="15"/>
               </w:rPr>
@@ -12364,7 +12364,7 @@
                 <w:rFonts w:ascii="EB Garamond" w:hAnsi="EB Garamond"/>
                 <w:b w:val="0"/>
                 <w:i/>
-                <w:color w:val="8A6F32"/>
+                <w:color w:val="A98A44"/>
                 <w:sz w:val="15"/>
                 <w:spacing w:val="15"/>
               </w:rPr>
@@ -12497,7 +12497,7 @@
                 <w:rFonts w:ascii="EB Garamond" w:hAnsi="EB Garamond"/>
                 <w:b w:val="0"/>
                 <w:i/>
-                <w:color w:val="8A6F32"/>
+                <w:color w:val="A98A44"/>
                 <w:sz w:val="15"/>
                 <w:spacing w:val="15"/>
               </w:rPr>
@@ -12624,7 +12624,7 @@
                 <w:rFonts w:ascii="EB Garamond" w:hAnsi="EB Garamond"/>
                 <w:b w:val="0"/>
                 <w:i/>
-                <w:color w:val="8A6F32"/>
+                <w:color w:val="A98A44"/>
                 <w:sz w:val="15"/>
                 <w:spacing w:val="15"/>
               </w:rPr>

</xml_diff>